<commit_message>
feat: HPS template download, role auto-init fix, new routes & templates
- Add GET /hps/harga-satuan/template endpoint for Excel template download
- Fix autoInitDatabase to always check and create missing built-in roles
- Add auth, HPS, audit, dokumen-generator, template-manager routes
- Add config, middleware, and auth types modules
- Update Prisma schema and seed for new HPS/procurement models
- Update electron-builder config and dependencies
- Improve SPPD template generation and document templates

Co-Authored-By: Claude Opus 4.6 <noreply@anthropic.com>
</commit_message>
<xml_diff>
--- a/template_word/ba_survey_harga.docx
+++ b/template_word/ba_survey_harga.docx
@@ -1,10 +1,10 @@
 
 <file path=word/document.xml><?xml version="1.0" encoding="utf-8"?>
-<w:document xmlns:wpc="http://schemas.microsoft.com/office/word/2010/wordprocessingCanvas" xmlns:mo="http://schemas.microsoft.com/office/mac/office/2008/main" xmlns:mc="http://schemas.openxmlformats.org/markup-compatibility/2006" xmlns:mv="urn:schemas-microsoft-com:mac:vml" xmlns:o="urn:schemas-microsoft-com:office:office" xmlns:r="http://schemas.openxmlformats.org/officeDocument/2006/relationships" xmlns:m="http://schemas.openxmlformats.org/officeDocument/2006/math" xmlns:v="urn:schemas-microsoft-com:vml" xmlns:wp14="http://schemas.microsoft.com/office/word/2010/wordprocessingDrawing" xmlns:wp="http://schemas.openxmlformats.org/drawingml/2006/wordprocessingDrawing" xmlns:w10="urn:schemas-microsoft-com:office:word" xmlns:w="http://schemas.openxmlformats.org/wordprocessingml/2006/main" xmlns:w14="http://schemas.microsoft.com/office/word/2010/wordml" xmlns:wpg="http://schemas.microsoft.com/office/word/2010/wordprocessingGroup" xmlns:wpi="http://schemas.microsoft.com/office/word/2010/wordprocessingInk" xmlns:wne="http://schemas.microsoft.com/office/word/2006/wordml" xmlns:wps="http://schemas.microsoft.com/office/word/2010/wordprocessingShape" mc:Ignorable="w14 wp14">
+<w:document xmlns:ns1="http://schemas.openxmlformats.org/markup-compatibility/2006" xmlns:w="http://schemas.openxmlformats.org/wordprocessingml/2006/main" ns1:Ignorable="w14 wp14">
   <w:body>
     <w:p>
       <w:pPr>
-        <w:spacing w:line="240" w:lineRule="auto"/>
+        <w:spacing w:line="240" w:lineRule="auto" w:before="0" w:after="0"/>
         <w:jc w:val="center"/>
       </w:pPr>
       <w:r>
@@ -17,12 +17,12 @@
     </w:p>
     <w:p>
       <w:pPr>
-        <w:spacing w:line="240" w:lineRule="auto"/>
+        <w:spacing w:line="240" w:lineRule="auto" w:before="0" w:after="0"/>
       </w:pPr>
     </w:p>
     <w:p>
       <w:pPr>
-        <w:spacing w:line="240" w:lineRule="auto"/>
+        <w:spacing w:line="240" w:lineRule="auto" w:before="0" w:after="0"/>
       </w:pPr>
       <w:r>
         <w:rPr>
@@ -38,7 +38,7 @@
     </w:p>
     <w:p>
       <w:pPr>
-        <w:spacing w:line="240" w:lineRule="auto"/>
+        <w:spacing w:line="240" w:lineRule="auto" w:before="0" w:after="0"/>
       </w:pPr>
       <w:r>
         <w:rPr>
@@ -54,12 +54,12 @@
     </w:p>
     <w:p>
       <w:pPr>
-        <w:spacing w:line="240" w:lineRule="auto"/>
+        <w:spacing w:line="240" w:lineRule="auto" w:before="0" w:after="0"/>
       </w:pPr>
     </w:p>
     <w:p>
       <w:pPr>
-        <w:spacing w:line="240" w:lineRule="auto"/>
+        <w:spacing w:line="240" w:lineRule="auto" w:before="0" w:after="0"/>
       </w:pPr>
       <w:r>
         <w:t>Pada hari ini {{hari}} tanggal {{tanggal_hari_ini_fmt}}, kami yang bertanda tangan di bawah ini, Pejabat Pembuat Komitmen pada {{satker_nama}}, telah melakukan survey harga untuk kegiatan pengadaan:</w:t>
@@ -69,7 +69,7 @@
     </w:p>
     <w:p>
       <w:pPr>
-        <w:spacing w:line="240" w:lineRule="auto"/>
+        <w:spacing w:line="240" w:lineRule="auto" w:before="0" w:after="0"/>
       </w:pPr>
       <w:r>
         <w:rPr>
@@ -86,7 +86,7 @@
     </w:p>
     <w:p>
       <w:pPr>
-        <w:spacing w:line="240" w:lineRule="auto"/>
+        <w:spacing w:line="240" w:lineRule="auto" w:before="0" w:after="0"/>
       </w:pPr>
       <w:r>
         <w:rPr>
@@ -103,7 +103,7 @@
     </w:p>
     <w:p>
       <w:pPr>
-        <w:spacing w:line="240" w:lineRule="auto"/>
+        <w:spacing w:line="240" w:lineRule="auto" w:before="0" w:after="0"/>
       </w:pPr>
       <w:r>
         <w:rPr>
@@ -119,12 +119,12 @@
     </w:p>
     <w:p>
       <w:pPr>
-        <w:spacing w:line="240" w:lineRule="auto"/>
+        <w:spacing w:line="240" w:lineRule="auto" w:before="0" w:after="0"/>
       </w:pPr>
     </w:p>
     <w:p>
       <w:pPr>
-        <w:spacing w:line="240" w:lineRule="auto"/>
+        <w:spacing w:line="240" w:lineRule="auto" w:before="0" w:after="0"/>
       </w:pPr>
       <w:r>
         <w:t>Survey dilakukan pada sumber-sumber berikut:</w:t>
@@ -150,7 +150,7 @@
           </w:tcPr>
           <w:p>
             <w:pPr>
-              <w:spacing w:line="240" w:lineRule="auto"/>
+              <w:spacing w:line="240" w:lineRule="auto" w:before="0" w:after="0"/>
             </w:pPr>
             <w:r>
               <w:rPr>
@@ -167,7 +167,7 @@
           </w:tcPr>
           <w:p>
             <w:pPr>
-              <w:spacing w:line="240" w:lineRule="auto"/>
+              <w:spacing w:line="240" w:lineRule="auto" w:before="0" w:after="0"/>
             </w:pPr>
             <w:r>
               <w:rPr>
@@ -184,7 +184,7 @@
           </w:tcPr>
           <w:p>
             <w:pPr>
-              <w:spacing w:line="240" w:lineRule="auto"/>
+              <w:spacing w:line="240" w:lineRule="auto" w:before="0" w:after="0"/>
             </w:pPr>
             <w:r>
               <w:rPr>
@@ -201,7 +201,7 @@
           </w:tcPr>
           <w:p>
             <w:pPr>
-              <w:spacing w:line="240" w:lineRule="auto"/>
+              <w:spacing w:line="240" w:lineRule="auto" w:before="0" w:after="0"/>
             </w:pPr>
             <w:r>
               <w:rPr>
@@ -219,7 +219,7 @@
           </w:tcPr>
           <w:p>
             <w:pPr>
-              <w:spacing w:line="240" w:lineRule="auto"/>
+              <w:spacing w:line="240" w:lineRule="auto" w:before="0" w:after="0"/>
             </w:pPr>
             <w:r>
               <w:t>1</w:t>
@@ -232,7 +232,7 @@
           </w:tcPr>
           <w:p>
             <w:pPr>
-              <w:spacing w:line="240" w:lineRule="auto"/>
+              <w:spacing w:line="240" w:lineRule="auto" w:before="0" w:after="0"/>
             </w:pPr>
             <w:r>
               <w:t>{{survey1_jenis}}</w:t>
@@ -245,7 +245,7 @@
           </w:tcPr>
           <w:p>
             <w:pPr>
-              <w:spacing w:line="240" w:lineRule="auto"/>
+              <w:spacing w:line="240" w:lineRule="auto" w:before="0" w:after="0"/>
             </w:pPr>
             <w:r>
               <w:t>{{survey1_nama}}</w:t>
@@ -258,7 +258,7 @@
           </w:tcPr>
           <w:p>
             <w:pPr>
-              <w:spacing w:line="240" w:lineRule="auto"/>
+              <w:spacing w:line="240" w:lineRule="auto" w:before="0" w:after="0"/>
             </w:pPr>
             <w:r>
               <w:t>{{survey1_alamat_lengkap}}</w:t>
@@ -273,7 +273,7 @@
           </w:tcPr>
           <w:p>
             <w:pPr>
-              <w:spacing w:line="240" w:lineRule="auto"/>
+              <w:spacing w:line="240" w:lineRule="auto" w:before="0" w:after="0"/>
             </w:pPr>
             <w:r>
               <w:t>2</w:t>
@@ -286,7 +286,7 @@
           </w:tcPr>
           <w:p>
             <w:pPr>
-              <w:spacing w:line="240" w:lineRule="auto"/>
+              <w:spacing w:line="240" w:lineRule="auto" w:before="0" w:after="0"/>
             </w:pPr>
             <w:r>
               <w:t>{{survey2_jenis}}</w:t>
@@ -299,7 +299,7 @@
           </w:tcPr>
           <w:p>
             <w:pPr>
-              <w:spacing w:line="240" w:lineRule="auto"/>
+              <w:spacing w:line="240" w:lineRule="auto" w:before="0" w:after="0"/>
             </w:pPr>
             <w:r>
               <w:t>{{survey2_nama}}</w:t>
@@ -312,7 +312,7 @@
           </w:tcPr>
           <w:p>
             <w:pPr>
-              <w:spacing w:line="240" w:lineRule="auto"/>
+              <w:spacing w:line="240" w:lineRule="auto" w:before="0" w:after="0"/>
             </w:pPr>
             <w:r>
               <w:t>{{survey2_alamat_lengkap}}</w:t>
@@ -327,7 +327,7 @@
           </w:tcPr>
           <w:p>
             <w:pPr>
-              <w:spacing w:line="240" w:lineRule="auto"/>
+              <w:spacing w:line="240" w:lineRule="auto" w:before="0" w:after="0"/>
             </w:pPr>
             <w:r>
               <w:t>3</w:t>
@@ -340,7 +340,7 @@
           </w:tcPr>
           <w:p>
             <w:pPr>
-              <w:spacing w:line="240" w:lineRule="auto"/>
+              <w:spacing w:line="240" w:lineRule="auto" w:before="0" w:after="0"/>
             </w:pPr>
             <w:r>
               <w:t>{{survey3_jenis}}</w:t>
@@ -353,7 +353,7 @@
           </w:tcPr>
           <w:p>
             <w:pPr>
-              <w:spacing w:line="240" w:lineRule="auto"/>
+              <w:spacing w:line="240" w:lineRule="auto" w:before="0" w:after="0"/>
             </w:pPr>
             <w:r>
               <w:t>{{survey3_nama}}</w:t>
@@ -366,7 +366,7 @@
           </w:tcPr>
           <w:p>
             <w:pPr>
-              <w:spacing w:line="240" w:lineRule="auto"/>
+              <w:spacing w:line="240" w:lineRule="auto" w:before="0" w:after="0"/>
             </w:pPr>
             <w:r>
               <w:t>{{survey3_alamat_lengkap}}</w:t>
@@ -377,12 +377,12 @@
     </w:tbl>
     <w:p>
       <w:pPr>
-        <w:spacing w:line="240" w:lineRule="auto"/>
+        <w:spacing w:line="240" w:lineRule="auto" w:before="0" w:after="0"/>
       </w:pPr>
     </w:p>
     <w:p>
       <w:pPr>
-        <w:spacing w:line="240" w:lineRule="auto"/>
+        <w:spacing w:line="240" w:lineRule="auto" w:before="0" w:after="0"/>
       </w:pPr>
       <w:r>
         <w:t>Dengan hasil survey sebagai berikut:</w:t>
@@ -412,7 +412,7 @@
           </w:tcPr>
           <w:p>
             <w:pPr>
-              <w:spacing w:line="240" w:lineRule="auto"/>
+              <w:spacing w:line="240" w:lineRule="auto" w:before="0" w:after="0"/>
               <w:jc w:val="center"/>
             </w:pPr>
             <w:r>
@@ -430,7 +430,7 @@
           </w:tcPr>
           <w:p>
             <w:pPr>
-              <w:spacing w:line="240" w:lineRule="auto"/>
+              <w:spacing w:line="240" w:lineRule="auto" w:before="0" w:after="0"/>
               <w:jc w:val="center"/>
             </w:pPr>
             <w:r>
@@ -448,7 +448,7 @@
           </w:tcPr>
           <w:p>
             <w:pPr>
-              <w:spacing w:line="240" w:lineRule="auto"/>
+              <w:spacing w:line="240" w:lineRule="auto" w:before="0" w:after="0"/>
               <w:jc w:val="center"/>
             </w:pPr>
             <w:r>
@@ -466,7 +466,7 @@
           </w:tcPr>
           <w:p>
             <w:pPr>
-              <w:spacing w:line="240" w:lineRule="auto"/>
+              <w:spacing w:line="240" w:lineRule="auto" w:before="0" w:after="0"/>
               <w:jc w:val="center"/>
             </w:pPr>
             <w:r>
@@ -484,7 +484,7 @@
           </w:tcPr>
           <w:p>
             <w:pPr>
-              <w:spacing w:line="240" w:lineRule="auto"/>
+              <w:spacing w:line="240" w:lineRule="auto" w:before="0" w:after="0"/>
               <w:jc w:val="center"/>
             </w:pPr>
             <w:r>
@@ -502,7 +502,7 @@
           </w:tcPr>
           <w:p>
             <w:pPr>
-              <w:spacing w:line="240" w:lineRule="auto"/>
+              <w:spacing w:line="240" w:lineRule="auto" w:before="0" w:after="0"/>
               <w:jc w:val="center"/>
             </w:pPr>
             <w:r>
@@ -520,7 +520,7 @@
           </w:tcPr>
           <w:p>
             <w:pPr>
-              <w:spacing w:line="240" w:lineRule="auto"/>
+              <w:spacing w:line="240" w:lineRule="auto" w:before="0" w:after="0"/>
               <w:jc w:val="center"/>
             </w:pPr>
             <w:r>
@@ -538,7 +538,7 @@
           </w:tcPr>
           <w:p>
             <w:pPr>
-              <w:spacing w:line="240" w:lineRule="auto"/>
+              <w:spacing w:line="240" w:lineRule="auto" w:before="0" w:after="0"/>
               <w:jc w:val="center"/>
             </w:pPr>
             <w:r>
@@ -557,7 +557,7 @@
           </w:tcPr>
           <w:p>
             <w:pPr>
-              <w:spacing w:line="240" w:lineRule="auto"/>
+              <w:spacing w:line="240" w:lineRule="auto" w:before="0" w:after="0"/>
             </w:pPr>
             <w:r>
               <w:t>{{no}}</w:t>
@@ -570,7 +570,7 @@
           </w:tcPr>
           <w:p>
             <w:pPr>
-              <w:spacing w:line="240" w:lineRule="auto"/>
+              <w:spacing w:line="240" w:lineRule="auto" w:before="0" w:after="0"/>
             </w:pPr>
             <w:r>
               <w:t>{{item.uraian}}</w:t>
@@ -583,7 +583,7 @@
           </w:tcPr>
           <w:p>
             <w:pPr>
-              <w:spacing w:line="240" w:lineRule="auto"/>
+              <w:spacing w:line="240" w:lineRule="auto" w:before="0" w:after="0"/>
             </w:pPr>
             <w:r>
               <w:t>{{item.satuan}}</w:t>
@@ -596,7 +596,7 @@
           </w:tcPr>
           <w:p>
             <w:pPr>
-              <w:spacing w:line="240" w:lineRule="auto"/>
+              <w:spacing w:line="240" w:lineRule="auto" w:before="0" w:after="0"/>
             </w:pPr>
             <w:r>
               <w:t>{{item.volume}}</w:t>
@@ -609,7 +609,7 @@
           </w:tcPr>
           <w:p>
             <w:pPr>
-              <w:spacing w:line="240" w:lineRule="auto"/>
+              <w:spacing w:line="240" w:lineRule="auto" w:before="0" w:after="0"/>
             </w:pPr>
             <w:r>
               <w:t>{{item.harga_survey1}}</w:t>
@@ -622,7 +622,7 @@
           </w:tcPr>
           <w:p>
             <w:pPr>
-              <w:spacing w:line="240" w:lineRule="auto"/>
+              <w:spacing w:line="240" w:lineRule="auto" w:before="0" w:after="0"/>
             </w:pPr>
             <w:r>
               <w:t>{{item.harga_survey2}}</w:t>
@@ -635,7 +635,7 @@
           </w:tcPr>
           <w:p>
             <w:pPr>
-              <w:spacing w:line="240" w:lineRule="auto"/>
+              <w:spacing w:line="240" w:lineRule="auto" w:before="0" w:after="0"/>
             </w:pPr>
             <w:r>
               <w:t>{{item.harga_survey3}}</w:t>
@@ -648,7 +648,7 @@
           </w:tcPr>
           <w:p>
             <w:pPr>
-              <w:spacing w:line="240" w:lineRule="auto"/>
+              <w:spacing w:line="240" w:lineRule="auto" w:before="0" w:after="0"/>
             </w:pPr>
             <w:r>
               <w:t>{{item.harga_rata}}</w:t>
@@ -659,12 +659,12 @@
     </w:tbl>
     <w:p>
       <w:pPr>
-        <w:spacing w:line="240" w:lineRule="auto"/>
+        <w:spacing w:line="240" w:lineRule="auto" w:before="0" w:after="0"/>
       </w:pPr>
     </w:p>
     <w:p>
       <w:pPr>
-        <w:spacing w:line="240" w:lineRule="auto"/>
+        <w:spacing w:line="240" w:lineRule="auto" w:before="0" w:after="0"/>
       </w:pPr>
       <w:r>
         <w:t>Demikian Berita Acara ini dibuat dengan sebenar-benarnya untuk dapat dipergunakan sebagaimana mestinya.</w:t>
@@ -672,12 +672,12 @@
     </w:p>
     <w:p>
       <w:pPr>
-        <w:spacing w:line="240" w:lineRule="auto"/>
+        <w:spacing w:line="240" w:lineRule="auto" w:before="0" w:after="0"/>
       </w:pPr>
     </w:p>
     <w:p>
       <w:pPr>
-        <w:spacing w:line="240" w:lineRule="auto"/>
+        <w:spacing w:line="240" w:lineRule="auto" w:before="0" w:after="0"/>
       </w:pPr>
     </w:p>
     <w:tbl>
@@ -696,7 +696,7 @@
           </w:tcPr>
           <w:p>
             <w:pPr>
-              <w:spacing w:line="240" w:lineRule="auto"/>
+              <w:spacing w:line="240" w:lineRule="auto" w:before="0" w:after="0"/>
               <w:jc w:val="center"/>
             </w:pPr>
           </w:p>
@@ -707,7 +707,7 @@
           </w:tcPr>
           <w:p>
             <w:pPr>
-              <w:spacing w:line="240" w:lineRule="auto"/>
+              <w:spacing w:line="240" w:lineRule="auto" w:before="0" w:after="0"/>
               <w:jc w:val="center"/>
             </w:pPr>
             <w:r>
@@ -723,7 +723,7 @@
           </w:tcPr>
           <w:p>
             <w:pPr>
-              <w:spacing w:line="240" w:lineRule="auto"/>
+              <w:spacing w:line="240" w:lineRule="auto" w:before="0" w:after="0"/>
               <w:jc w:val="center"/>
             </w:pPr>
           </w:p>
@@ -734,7 +734,7 @@
           </w:tcPr>
           <w:p>
             <w:pPr>
-              <w:spacing w:line="240" w:lineRule="auto"/>
+              <w:spacing w:line="240" w:lineRule="auto" w:before="0" w:after="0"/>
               <w:jc w:val="center"/>
             </w:pPr>
             <w:r>
@@ -750,7 +750,7 @@
           </w:tcPr>
           <w:p>
             <w:pPr>
-              <w:spacing w:line="240" w:lineRule="auto"/>
+              <w:spacing w:line="240" w:lineRule="auto" w:before="0" w:after="0"/>
               <w:jc w:val="center"/>
             </w:pPr>
           </w:p>
@@ -761,7 +761,7 @@
           </w:tcPr>
           <w:p>
             <w:pPr>
-              <w:spacing w:line="240" w:lineRule="auto"/>
+              <w:spacing w:line="240" w:lineRule="auto" w:before="0" w:after="0"/>
               <w:jc w:val="center"/>
             </w:pPr>
           </w:p>
@@ -774,7 +774,7 @@
           </w:tcPr>
           <w:p>
             <w:pPr>
-              <w:spacing w:line="240" w:lineRule="auto"/>
+              <w:spacing w:line="240" w:lineRule="auto" w:before="0" w:after="0"/>
               <w:jc w:val="center"/>
             </w:pPr>
           </w:p>
@@ -785,7 +785,7 @@
           </w:tcPr>
           <w:p>
             <w:pPr>
-              <w:spacing w:line="240" w:lineRule="auto"/>
+              <w:spacing w:line="240" w:lineRule="auto" w:before="0" w:after="0"/>
               <w:jc w:val="center"/>
             </w:pPr>
             <w:r>
@@ -801,7 +801,7 @@
           </w:tcPr>
           <w:p>
             <w:pPr>
-              <w:spacing w:line="240" w:lineRule="auto"/>
+              <w:spacing w:line="240" w:lineRule="auto" w:before="0" w:after="0"/>
               <w:jc w:val="center"/>
             </w:pPr>
           </w:p>
@@ -812,7 +812,7 @@
           </w:tcPr>
           <w:p>
             <w:pPr>
-              <w:spacing w:line="240" w:lineRule="auto"/>
+              <w:spacing w:line="240" w:lineRule="auto" w:before="0" w:after="0"/>
               <w:jc w:val="center"/>
             </w:pPr>
             <w:r>

</xml_diff>